<commit_message>
Add welcome guide for first-time Forumly users
</commit_message>
<xml_diff>
--- a/Major Project - Codebase Map - Linh Nguyen - s5452023.docx
+++ b/Major Project - Codebase Map - Linh Nguyen - s5452023.docx
@@ -45,13 +45,7 @@
         <w:rPr>
           <w:b/>
         </w:rPr>
-        <w:t>A</w:t>
-      </w:r>
-      <w:r>
-        <w:rPr>
-          <w:b/>
-        </w:rPr>
-        <w:t>pp purpose (one sentence - “This app helps [who] to [do what]”):</w:t>
+        <w:t>App purpose (one sentence - “This app helps [who] to [do what]”):</w:t>
       </w:r>
     </w:p>
     <w:p>
@@ -69,13 +63,7 @@
         <w:rPr>
           <w:b/>
         </w:rPr>
-        <w:t>Target grade and result</w:t>
-      </w:r>
-      <w:r>
-        <w:rPr>
-          <w:b/>
-        </w:rPr>
-        <w:t>ing Complexity total (core points earned + features claimed):</w:t>
+        <w:t>Target grade and resulting Complexity total (core points earned + features claimed):</w:t>
       </w:r>
     </w:p>
     <w:p>
@@ -88,10 +76,7 @@
         <w:pStyle w:val="Heading1"/>
       </w:pPr>
       <w:r>
-        <w:t>P</w:t>
-      </w:r>
-      <w:r>
-        <w:t>roudest code</w:t>
+        <w:t>Proudest code</w:t>
       </w:r>
     </w:p>
     <w:p>
@@ -152,18 +137,12 @@
         <w:rPr>
           <w:b/>
         </w:rPr>
-        <w:t>W</w:t>
-      </w:r>
-      <w:r>
-        <w:rPr>
-          <w:b/>
-        </w:rPr>
-        <w:t>here AI helped you most, and one concrete instance where AI produced a bug or bad architecture that you found and fixed:</w:t>
+        <w:t>Where AI helped you most, and one concrete instance where AI produced a bug or bad architecture that you found and fixed:</w:t>
       </w:r>
     </w:p>
     <w:p>
       <w:r>
-        <w:t>AI helped me most with generating and refining Laravel code and suggesting common implementation patterns. However, I found that AI often defaulted to popular design choices without first considering what my application actually needed. For example, it repeatedly suggested arbitrary limits on uploaded file numbers and sizes. I reviewed the requirements and decided on the behaviour I wanted, then changed the implementation accordingly rather than accepting the AI's defaults. I also had to manually improve several UI elements because AI-generated interfaces were sometimes visually inconsistent even when the code itself was functional.</w:t>
+        <w:t>AI helped me most with generating and refining Laravel code and suggesting common implementation patterns. AI initially generated restrictive MIME-type and upload-count rules based on common image-upload patterns. That architecture did not match Forumly’s general-purpose attachment feature. I identified the mismatch and replaced those restrictions with Laravel’s file validation and a deliberate 10 MB per-file limit. I also stored the detected MIME type, original filename, size, and storage path as metadata so different attachment types could be displayed and downloaded consistently.</w:t>
       </w:r>
     </w:p>
     <w:p>
@@ -1080,6 +1059,39 @@
               <w:t>–29</w:t>
             </w:r>
           </w:p>
+          <w:p>
+            <w:pPr>
+              <w:pStyle w:val="ListParagraph"/>
+              <w:numPr>
+                <w:ilvl w:val="0"/>
+                <w:numId w:val="17"/>
+              </w:numPr>
+            </w:pPr>
+            <w:r>
+              <w:t>app/Http/Controllers/CommentController.php @ 11–30</w:t>
+            </w:r>
+          </w:p>
+          <w:p>
+            <w:pPr>
+              <w:pStyle w:val="ListParagraph"/>
+              <w:numPr>
+                <w:ilvl w:val="0"/>
+                <w:numId w:val="17"/>
+              </w:numPr>
+            </w:pPr>
+            <w:r>
+              <w:t>app/Http/Controllers/PostController.php @ 1</w:t>
+            </w:r>
+            <w:r>
+              <w:t>41</w:t>
+            </w:r>
+            <w:r>
+              <w:t>–14</w:t>
+            </w:r>
+            <w:r>
+              <w:t>5</w:t>
+            </w:r>
+          </w:p>
         </w:tc>
         <w:tc>
           <w:tcPr>
@@ -1120,7 +1132,11 @@
           </w:tcPr>
           <w:p>
             <w:r>
-              <w:t xml:space="preserve">5th related table </w:t>
+              <w:t xml:space="preserve">5th related </w:t>
+            </w:r>
+            <w:r>
+              <w:lastRenderedPageBreak/>
+              <w:t xml:space="preserve">table </w:t>
             </w:r>
           </w:p>
         </w:tc>
@@ -1137,7 +1153,14 @@
               </w:numPr>
             </w:pPr>
             <w:r>
-              <w:t xml:space="preserve">app/Models/Comment.php @ </w:t>
+              <w:lastRenderedPageBreak/>
+              <w:t>app/Models/</w:t>
+            </w:r>
+            <w:r>
+              <w:t>Vote</w:t>
+            </w:r>
+            <w:r>
+              <w:t xml:space="preserve">.php @ </w:t>
             </w:r>
             <w:r>
               <w:t>10</w:t>
@@ -1147,6 +1170,19 @@
             </w:r>
             <w:r>
               <w:t>21</w:t>
+            </w:r>
+          </w:p>
+          <w:p>
+            <w:pPr>
+              <w:pStyle w:val="ListParagraph"/>
+              <w:numPr>
+                <w:ilvl w:val="0"/>
+                <w:numId w:val="17"/>
+              </w:numPr>
+            </w:pPr>
+            <w:r>
+              <w:lastRenderedPageBreak/>
+              <w:t>app/Http/Controllers/VoteController.php @ 11–21</w:t>
             </w:r>
           </w:p>
         </w:tc>
@@ -1156,6 +1192,7 @@
           </w:tcPr>
           <w:p>
             <w:r>
+              <w:lastRenderedPageBreak/>
               <w:t>Complete</w:t>
             </w:r>
           </w:p>
@@ -1167,6 +1204,7 @@
           </w:tcPr>
           <w:p>
             <w:r>
+              <w:lastRenderedPageBreak/>
               <w:t>+0.03</w:t>
             </w:r>
           </w:p>
@@ -1189,11 +1227,7 @@
           </w:tcPr>
           <w:p>
             <w:r>
-              <w:t xml:space="preserve">Many-to-many via a </w:t>
-            </w:r>
-            <w:r>
-              <w:lastRenderedPageBreak/>
-              <w:t>pivot table</w:t>
+              <w:t>Many-to-many via a pivot table</w:t>
             </w:r>
           </w:p>
         </w:tc>
@@ -1210,7 +1244,6 @@
               </w:numPr>
             </w:pPr>
             <w:r>
-              <w:lastRenderedPageBreak/>
               <w:t>app/Models/User.php @ 46–50</w:t>
             </w:r>
           </w:p>
@@ -1235,17 +1268,22 @@
               </w:numPr>
             </w:pPr>
             <w:r>
-              <w:lastRenderedPageBreak/>
-              <w:t>app/Models/Comment.php @ 1</w:t>
-            </w:r>
-            <w:r>
-              <w:t>2</w:t>
+              <w:t>app/Models/</w:t>
+            </w:r>
+            <w:r>
+              <w:t>Vote</w:t>
+            </w:r>
+            <w:r>
+              <w:t>.php @ 1</w:t>
+            </w:r>
+            <w:r>
+              <w:t>0</w:t>
             </w:r>
             <w:r>
               <w:t>–2</w:t>
             </w:r>
             <w:r>
-              <w:t>0</w:t>
+              <w:t>1</w:t>
             </w:r>
           </w:p>
           <w:p>
@@ -1267,7 +1305,6 @@
           </w:tcPr>
           <w:p>
             <w:r>
-              <w:lastRenderedPageBreak/>
               <w:t>Complete</w:t>
             </w:r>
           </w:p>
@@ -1648,7 +1685,10 @@
           </w:tcPr>
           <w:p>
             <w:r>
-              <w:t>+0.08</w:t>
+              <w:t>+0.0</w:t>
+            </w:r>
+            <w:r>
+              <w:t>0</w:t>
             </w:r>
           </w:p>
         </w:tc>

</xml_diff>